<commit_message>
docs: record version 1.5 in the change-control table
</commit_message>
<xml_diff>
--- a/Documentacion/pruebas/Actividad módulo 2_Tabla Control de cambios y versiones.docx
+++ b/Documentacion/pruebas/Actividad módulo 2_Tabla Control de cambios y versiones.docx
@@ -1597,6 +1597,108 @@
                 <w:szCs w:val="20"/>
               </w:rPr>
               <w:t>Reglas de operación decididas por el equipo: la auxiliar administra el catálogo de odontólogos, horarios, procedimientos y usuarios; si al agendar ya pasó la hora del recordatorio, este se envía en ese momento, sin restringir el agendamiento; un envío fallido por WhatsApp se reintenta hasta 3 veces con 5 minutos entre intentos. El plan de pruebas pasa a la versión 1.2 con 44 casos (nuevo CP-RF05-06).</w:t>
+            </w:r>
+          </w:p>
+        </w:tc>
+        <w:tc>
+          <w:tcPr>
+            <w:tcW w:type="dxa" w:w="2200"/>
+            <w:tcMar>
+              <w:top w:type="dxa" w:w="60"/>
+              <w:left w:type="dxa" w:w="90"/>
+              <w:bottom w:type="dxa" w:w="60"/>
+              <w:right w:type="dxa" w:w="90"/>
+            </w:tcMar>
+          </w:tcPr>
+          <w:p>
+            <w:pPr>
+              <w:spacing w:after="0"/>
+            </w:pPr>
+            <w:r>
+              <w:rPr>
+                <w:b w:val="false"/>
+                <w:bCs w:val="false"/>
+                <w:sz w:val="20"/>
+                <w:szCs w:val="20"/>
+              </w:rPr>
+              <w:t xml:space="preserve">Yenderson Josué Rangel Martínez</w:t>
+            </w:r>
+          </w:p>
+        </w:tc>
+      </w:tr>
+      <w:tr>
+        <w:tc>
+          <w:tcPr>
+            <w:tcW w:type="dxa" w:w="1500"/>
+            <w:tcMar>
+              <w:top w:type="dxa" w:w="60"/>
+              <w:left w:type="dxa" w:w="90"/>
+              <w:bottom w:type="dxa" w:w="60"/>
+              <w:right w:type="dxa" w:w="90"/>
+            </w:tcMar>
+          </w:tcPr>
+          <w:p>
+            <w:pPr>
+              <w:spacing w:after="0"/>
+            </w:pPr>
+            <w:r>
+              <w:rPr>
+                <w:b w:val="false"/>
+                <w:bCs w:val="false"/>
+                <w:sz w:val="20"/>
+                <w:szCs w:val="20"/>
+              </w:rPr>
+              <w:t xml:space="preserve">23/10/2026</w:t>
+            </w:r>
+          </w:p>
+        </w:tc>
+        <w:tc>
+          <w:tcPr>
+            <w:tcW w:type="dxa" w:w="1000"/>
+            <w:tcMar>
+              <w:top w:type="dxa" w:w="60"/>
+              <w:left w:type="dxa" w:w="90"/>
+              <w:bottom w:type="dxa" w:w="60"/>
+              <w:right w:type="dxa" w:w="90"/>
+            </w:tcMar>
+          </w:tcPr>
+          <w:p>
+            <w:pPr>
+              <w:spacing w:after="0"/>
+            </w:pPr>
+            <w:r>
+              <w:rPr>
+                <w:b w:val="false"/>
+                <w:bCs w:val="false"/>
+                <w:sz w:val="20"/>
+                <w:szCs w:val="20"/>
+              </w:rPr>
+              <w:t xml:space="preserve">1.5</w:t>
+            </w:r>
+          </w:p>
+        </w:tc>
+        <w:tc>
+          <w:tcPr>
+            <w:tcW w:type="dxa" w:w="4660"/>
+            <w:tcMar>
+              <w:top w:type="dxa" w:w="60"/>
+              <w:left w:type="dxa" w:w="90"/>
+              <w:bottom w:type="dxa" w:w="60"/>
+              <w:right w:type="dxa" w:w="90"/>
+            </w:tcMar>
+          </w:tcPr>
+          <w:p>
+            <w:pPr>
+              <w:spacing w:after="0"/>
+            </w:pPr>
+            <w:r>
+              <w:rPr>
+                <w:b w:val="false"/>
+                <w:bCs w:val="false"/>
+                <w:sz w:val="20"/>
+                <w:szCs w:val="20"/>
+              </w:rPr>
+              <w:t>Cierre del ciclo 1 del backend: autenticación JWT con roles, gestión de usuarios, odontólogos, horarios y procedimientos, registro de pacientes y consulta pública de disponibilidad por odontólogo, con pruebas de integración sobre PostgreSQL.</w:t>
             </w:r>
           </w:p>
         </w:tc>

</xml_diff>

<commit_message>
docs: record version 1.6 in the change-control table
</commit_message>
<xml_diff>
--- a/Documentacion/pruebas/Actividad módulo 2_Tabla Control de cambios y versiones.docx
+++ b/Documentacion/pruebas/Actividad módulo 2_Tabla Control de cambios y versiones.docx
@@ -1699,6 +1699,108 @@
                 <w:szCs w:val="20"/>
               </w:rPr>
               <w:t>Cierre del ciclo 1 del backend: autenticación JWT con roles, gestión de usuarios, odontólogos, horarios y procedimientos, registro de pacientes y consulta pública de disponibilidad por odontólogo, con pruebas de integración sobre PostgreSQL.</w:t>
+            </w:r>
+          </w:p>
+        </w:tc>
+        <w:tc>
+          <w:tcPr>
+            <w:tcW w:type="dxa" w:w="2200"/>
+            <w:tcMar>
+              <w:top w:type="dxa" w:w="60"/>
+              <w:left w:type="dxa" w:w="90"/>
+              <w:bottom w:type="dxa" w:w="60"/>
+              <w:right w:type="dxa" w:w="90"/>
+            </w:tcMar>
+          </w:tcPr>
+          <w:p>
+            <w:pPr>
+              <w:spacing w:after="0"/>
+            </w:pPr>
+            <w:r>
+              <w:rPr>
+                <w:b w:val="false"/>
+                <w:bCs w:val="false"/>
+                <w:sz w:val="20"/>
+                <w:szCs w:val="20"/>
+              </w:rPr>
+              <w:t xml:space="preserve">Yenderson Josué Rangel Martínez</w:t>
+            </w:r>
+          </w:p>
+        </w:tc>
+      </w:tr>
+      <w:tr>
+        <w:tc>
+          <w:tcPr>
+            <w:tcW w:type="dxa" w:w="1500"/>
+            <w:tcMar>
+              <w:top w:type="dxa" w:w="60"/>
+              <w:left w:type="dxa" w:w="90"/>
+              <w:bottom w:type="dxa" w:w="60"/>
+              <w:right w:type="dxa" w:w="90"/>
+            </w:tcMar>
+          </w:tcPr>
+          <w:p>
+            <w:pPr>
+              <w:spacing w:after="0"/>
+            </w:pPr>
+            <w:r>
+              <w:rPr>
+                <w:b w:val="false"/>
+                <w:bCs w:val="false"/>
+                <w:sz w:val="20"/>
+                <w:szCs w:val="20"/>
+              </w:rPr>
+              <w:t xml:space="preserve">23/10/2026</w:t>
+            </w:r>
+          </w:p>
+        </w:tc>
+        <w:tc>
+          <w:tcPr>
+            <w:tcW w:type="dxa" w:w="1000"/>
+            <w:tcMar>
+              <w:top w:type="dxa" w:w="60"/>
+              <w:left w:type="dxa" w:w="90"/>
+              <w:bottom w:type="dxa" w:w="60"/>
+              <w:right w:type="dxa" w:w="90"/>
+            </w:tcMar>
+          </w:tcPr>
+          <w:p>
+            <w:pPr>
+              <w:spacing w:after="0"/>
+            </w:pPr>
+            <w:r>
+              <w:rPr>
+                <w:b w:val="false"/>
+                <w:bCs w:val="false"/>
+                <w:sz w:val="20"/>
+                <w:szCs w:val="20"/>
+              </w:rPr>
+              <w:t xml:space="preserve">1.6</w:t>
+            </w:r>
+          </w:p>
+        </w:tc>
+        <w:tc>
+          <w:tcPr>
+            <w:tcW w:type="dxa" w:w="4660"/>
+            <w:tcMar>
+              <w:top w:type="dxa" w:w="60"/>
+              <w:left w:type="dxa" w:w="90"/>
+              <w:bottom w:type="dxa" w:w="60"/>
+              <w:right w:type="dxa" w:w="90"/>
+            </w:tcMar>
+          </w:tcPr>
+          <w:p>
+            <w:pPr>
+              <w:spacing w:after="0"/>
+            </w:pPr>
+            <w:r>
+              <w:rPr>
+                <w:b w:val="false"/>
+                <w:bCs w:val="false"/>
+                <w:sz w:val="20"/>
+                <w:szCs w:val="20"/>
+              </w:rPr>
+              <w:t>Se completa el ciclo 2 del backend (RF04, RF07 y RF08): el agendamiento público y el manual usan la duración del procedimiento, cada paciente queda limitado a una cita activa y PostgreSQL bloquea las dobles reservas simultáneas; se agrega la agenda central por fecha y odontólogo con permisos por rol.</w:t>
             </w:r>
           </w:p>
         </w:tc>

</xml_diff>

<commit_message>
docs: record version 1.7 in the change-control table
</commit_message>
<xml_diff>
--- a/Documentacion/pruebas/Actividad módulo 2_Tabla Control de cambios y versiones.docx
+++ b/Documentacion/pruebas/Actividad módulo 2_Tabla Control de cambios y versiones.docx
@@ -1801,6 +1801,108 @@
                 <w:szCs w:val="20"/>
               </w:rPr>
               <w:t>Se completa el ciclo 2 del backend (RF04, RF07 y RF08): el agendamiento público y el manual usan la duración del procedimiento, cada paciente queda limitado a una cita activa y PostgreSQL bloquea las dobles reservas simultáneas; se agrega la agenda central por fecha y odontólogo con permisos por rol.</w:t>
+            </w:r>
+          </w:p>
+        </w:tc>
+        <w:tc>
+          <w:tcPr>
+            <w:tcW w:type="dxa" w:w="2200"/>
+            <w:tcMar>
+              <w:top w:type="dxa" w:w="60"/>
+              <w:left w:type="dxa" w:w="90"/>
+              <w:bottom w:type="dxa" w:w="60"/>
+              <w:right w:type="dxa" w:w="90"/>
+            </w:tcMar>
+          </w:tcPr>
+          <w:p>
+            <w:pPr>
+              <w:spacing w:after="0"/>
+            </w:pPr>
+            <w:r>
+              <w:rPr>
+                <w:b w:val="false"/>
+                <w:bCs w:val="false"/>
+                <w:sz w:val="20"/>
+                <w:szCs w:val="20"/>
+              </w:rPr>
+              <w:t xml:space="preserve">Yenderson Josué Rangel Martínez</w:t>
+            </w:r>
+          </w:p>
+        </w:tc>
+      </w:tr>
+      <w:tr>
+        <w:tc>
+          <w:tcPr>
+            <w:tcW w:type="dxa" w:w="1500"/>
+            <w:tcMar>
+              <w:top w:type="dxa" w:w="60"/>
+              <w:left w:type="dxa" w:w="90"/>
+              <w:bottom w:type="dxa" w:w="60"/>
+              <w:right w:type="dxa" w:w="90"/>
+            </w:tcMar>
+          </w:tcPr>
+          <w:p>
+            <w:pPr>
+              <w:spacing w:after="0"/>
+            </w:pPr>
+            <w:r>
+              <w:rPr>
+                <w:b w:val="false"/>
+                <w:bCs w:val="false"/>
+                <w:sz w:val="20"/>
+                <w:szCs w:val="20"/>
+              </w:rPr>
+              <w:t xml:space="preserve">23/10/2026</w:t>
+            </w:r>
+          </w:p>
+        </w:tc>
+        <w:tc>
+          <w:tcPr>
+            <w:tcW w:type="dxa" w:w="1000"/>
+            <w:tcMar>
+              <w:top w:type="dxa" w:w="60"/>
+              <w:left w:type="dxa" w:w="90"/>
+              <w:bottom w:type="dxa" w:w="60"/>
+              <w:right w:type="dxa" w:w="90"/>
+            </w:tcMar>
+          </w:tcPr>
+          <w:p>
+            <w:pPr>
+              <w:spacing w:after="0"/>
+            </w:pPr>
+            <w:r>
+              <w:rPr>
+                <w:b w:val="false"/>
+                <w:bCs w:val="false"/>
+                <w:sz w:val="20"/>
+                <w:szCs w:val="20"/>
+              </w:rPr>
+              <w:t xml:space="preserve">1.7</w:t>
+            </w:r>
+          </w:p>
+        </w:tc>
+        <w:tc>
+          <w:tcPr>
+            <w:tcW w:type="dxa" w:w="4660"/>
+            <w:tcMar>
+              <w:top w:type="dxa" w:w="60"/>
+              <w:left w:type="dxa" w:w="90"/>
+              <w:bottom w:type="dxa" w:w="60"/>
+              <w:right w:type="dxa" w:w="90"/>
+            </w:tcMar>
+          </w:tcPr>
+          <w:p>
+            <w:pPr>
+              <w:spacing w:after="0"/>
+            </w:pPr>
+            <w:r>
+              <w:rPr>
+                <w:b w:val="false"/>
+                <w:bCs w:val="false"/>
+                <w:sz w:val="20"/>
+                <w:szCs w:val="20"/>
+              </w:rPr>
+              <w:t>Se completó el ciclo 3 del backend: recordatorios automáticos por WhatsApp con reintentos y enlace personal para que el paciente confirme, cancele o reprograme su cita.</w:t>
             </w:r>
           </w:p>
         </w:tc>

</xml_diff>

<commit_message>
docs: record version 1.8 in the change-control table
</commit_message>
<xml_diff>
--- a/Documentacion/pruebas/Actividad módulo 2_Tabla Control de cambios y versiones.docx
+++ b/Documentacion/pruebas/Actividad módulo 2_Tabla Control de cambios y versiones.docx
@@ -1903,6 +1903,108 @@
                 <w:szCs w:val="20"/>
               </w:rPr>
               <w:t>Se completó el ciclo 3 del backend: recordatorios automáticos por WhatsApp con reintentos y enlace personal para que el paciente confirme, cancele o reprograme su cita.</w:t>
+            </w:r>
+          </w:p>
+        </w:tc>
+        <w:tc>
+          <w:tcPr>
+            <w:tcW w:type="dxa" w:w="2200"/>
+            <w:tcMar>
+              <w:top w:type="dxa" w:w="60"/>
+              <w:left w:type="dxa" w:w="90"/>
+              <w:bottom w:type="dxa" w:w="60"/>
+              <w:right w:type="dxa" w:w="90"/>
+            </w:tcMar>
+          </w:tcPr>
+          <w:p>
+            <w:pPr>
+              <w:spacing w:after="0"/>
+            </w:pPr>
+            <w:r>
+              <w:rPr>
+                <w:b w:val="false"/>
+                <w:bCs w:val="false"/>
+                <w:sz w:val="20"/>
+                <w:szCs w:val="20"/>
+              </w:rPr>
+              <w:t xml:space="preserve">Yenderson Josué Rangel Martínez</w:t>
+            </w:r>
+          </w:p>
+        </w:tc>
+      </w:tr>
+      <w:tr>
+        <w:tc>
+          <w:tcPr>
+            <w:tcW w:type="dxa" w:w="1500"/>
+            <w:tcMar>
+              <w:top w:type="dxa" w:w="60"/>
+              <w:left w:type="dxa" w:w="90"/>
+              <w:bottom w:type="dxa" w:w="60"/>
+              <w:right w:type="dxa" w:w="90"/>
+            </w:tcMar>
+          </w:tcPr>
+          <w:p>
+            <w:pPr>
+              <w:spacing w:after="0"/>
+            </w:pPr>
+            <w:r>
+              <w:rPr>
+                <w:b w:val="false"/>
+                <w:bCs w:val="false"/>
+                <w:sz w:val="20"/>
+                <w:szCs w:val="20"/>
+              </w:rPr>
+              <w:t xml:space="preserve">23/10/2026</w:t>
+            </w:r>
+          </w:p>
+        </w:tc>
+        <w:tc>
+          <w:tcPr>
+            <w:tcW w:type="dxa" w:w="1000"/>
+            <w:tcMar>
+              <w:top w:type="dxa" w:w="60"/>
+              <w:left w:type="dxa" w:w="90"/>
+              <w:bottom w:type="dxa" w:w="60"/>
+              <w:right w:type="dxa" w:w="90"/>
+            </w:tcMar>
+          </w:tcPr>
+          <w:p>
+            <w:pPr>
+              <w:spacing w:after="0"/>
+            </w:pPr>
+            <w:r>
+              <w:rPr>
+                <w:b w:val="false"/>
+                <w:bCs w:val="false"/>
+                <w:sz w:val="20"/>
+                <w:szCs w:val="20"/>
+              </w:rPr>
+              <w:t xml:space="preserve">1.8</w:t>
+            </w:r>
+          </w:p>
+        </w:tc>
+        <w:tc>
+          <w:tcPr>
+            <w:tcW w:type="dxa" w:w="4660"/>
+            <w:tcMar>
+              <w:top w:type="dxa" w:w="60"/>
+              <w:left w:type="dxa" w:w="90"/>
+              <w:bottom w:type="dxa" w:w="60"/>
+              <w:right w:type="dxa" w:w="90"/>
+            </w:tcMar>
+          </w:tcPr>
+          <w:p>
+            <w:pPr>
+              <w:spacing w:after="0"/>
+            </w:pPr>
+            <w:r>
+              <w:rPr>
+                <w:b w:val="false"/>
+                <w:bCs w:val="false"/>
+                <w:sz w:val="20"/>
+                <w:szCs w:val="20"/>
+              </w:rPr>
+              <w:t>Se completó el ciclo 4 del backend (RF10): reportes administrativos por rango de fechas y odontólogo con totales de citas, cancelaciones e inasistencias, detalle diario y exportación CSV para la auxiliar.</w:t>
             </w:r>
           </w:p>
         </w:tc>

</xml_diff>

<commit_message>
docs: record version 1.9 in the change-control table
</commit_message>
<xml_diff>
--- a/Documentacion/pruebas/Actividad módulo 2_Tabla Control de cambios y versiones.docx
+++ b/Documentacion/pruebas/Actividad módulo 2_Tabla Control de cambios y versiones.docx
@@ -2005,6 +2005,108 @@
                 <w:szCs w:val="20"/>
               </w:rPr>
               <w:t>Se completó el ciclo 4 del backend (RF10): reportes administrativos por rango de fechas y odontólogo con totales de citas, cancelaciones e inasistencias, detalle diario y exportación CSV para la auxiliar.</w:t>
+            </w:r>
+          </w:p>
+        </w:tc>
+        <w:tc>
+          <w:tcPr>
+            <w:tcW w:type="dxa" w:w="2200"/>
+            <w:tcMar>
+              <w:top w:type="dxa" w:w="60"/>
+              <w:left w:type="dxa" w:w="90"/>
+              <w:bottom w:type="dxa" w:w="60"/>
+              <w:right w:type="dxa" w:w="90"/>
+            </w:tcMar>
+          </w:tcPr>
+          <w:p>
+            <w:pPr>
+              <w:spacing w:after="0"/>
+            </w:pPr>
+            <w:r>
+              <w:rPr>
+                <w:b w:val="false"/>
+                <w:bCs w:val="false"/>
+                <w:sz w:val="20"/>
+                <w:szCs w:val="20"/>
+              </w:rPr>
+              <w:t xml:space="preserve">Yenderson Josué Rangel Martínez</w:t>
+            </w:r>
+          </w:p>
+        </w:tc>
+      </w:tr>
+      <w:tr>
+        <w:tc>
+          <w:tcPr>
+            <w:tcW w:type="dxa" w:w="1500"/>
+            <w:tcMar>
+              <w:top w:type="dxa" w:w="60"/>
+              <w:left w:type="dxa" w:w="90"/>
+              <w:bottom w:type="dxa" w:w="60"/>
+              <w:right w:type="dxa" w:w="90"/>
+            </w:tcMar>
+          </w:tcPr>
+          <w:p>
+            <w:pPr>
+              <w:spacing w:after="0"/>
+            </w:pPr>
+            <w:r>
+              <w:rPr>
+                <w:b w:val="false"/>
+                <w:bCs w:val="false"/>
+                <w:sz w:val="20"/>
+                <w:szCs w:val="20"/>
+              </w:rPr>
+              <w:t xml:space="preserve">24/10/2026</w:t>
+            </w:r>
+          </w:p>
+        </w:tc>
+        <w:tc>
+          <w:tcPr>
+            <w:tcW w:type="dxa" w:w="1000"/>
+            <w:tcMar>
+              <w:top w:type="dxa" w:w="60"/>
+              <w:left w:type="dxa" w:w="90"/>
+              <w:bottom w:type="dxa" w:w="60"/>
+              <w:right w:type="dxa" w:w="90"/>
+            </w:tcMar>
+          </w:tcPr>
+          <w:p>
+            <w:pPr>
+              <w:spacing w:after="0"/>
+            </w:pPr>
+            <w:r>
+              <w:rPr>
+                <w:b w:val="false"/>
+                <w:bCs w:val="false"/>
+                <w:sz w:val="20"/>
+                <w:szCs w:val="20"/>
+              </w:rPr>
+              <w:t xml:space="preserve">1.9</w:t>
+            </w:r>
+          </w:p>
+        </w:tc>
+        <w:tc>
+          <w:tcPr>
+            <w:tcW w:type="dxa" w:w="4660"/>
+            <w:tcMar>
+              <w:top w:type="dxa" w:w="60"/>
+              <w:left w:type="dxa" w:w="90"/>
+              <w:bottom w:type="dxa" w:w="60"/>
+              <w:right w:type="dxa" w:w="90"/>
+            </w:tcMar>
+          </w:tcPr>
+          <w:p>
+            <w:pPr>
+              <w:spacing w:after="0"/>
+            </w:pPr>
+            <w:r>
+              <w:rPr>
+                <w:b w:val="false"/>
+                <w:bCs w:val="false"/>
+                <w:sz w:val="20"/>
+                <w:szCs w:val="20"/>
+              </w:rPr>
+              <w:t>Integración del frontend con el backend: todas las pantallas dejan los datos simulados y trabajan con la API real (catálogos, disponibilidad, agendamiento público, enlace personal de la cita, ingreso del personal, agenda, citas manuales, cambios de estado, reprogramación y reportes con exportación CSV). Se verificó la aplicación completa en el navegador y se corrigieron los errores que solo aparecían con datos reales; el frontend en Docker ahora llega a la API del equipo.</w:t>
             </w:r>
           </w:p>
         </w:tc>

</xml_diff>